<commit_message>
ohnb motion-brief: complete transcription of FILED-EXAMPLE-motion-brief (fb-w0vj.1)
The old INPUT-motion-brief.md transcribed FILED-EXAMPLE-motion-brief-2 (Templar); it moves to INPUT-motion-brief-2.md, its pair. The new INPUT-motion-brief.md is a full transcription of the Meddings motion. fb diff --content: G0 PASS (7 pages); G2 residuals template-driven (the template always adds a notice-of-motion paragraph).
</commit_message>
<xml_diff>
--- a/courts/sixth-circuit/ohio/federal/bankruptcy-northern-district/motion-brief/usage/OUTPUT-motion-brief.docx
+++ b/courts/sixth-circuit/ohio/federal/bankruptcy-northern-district/motion-brief/usage/OUTPUT-motion-brief.docx
@@ -7,7 +7,7 @@
         <w:pStyle w:val="Centered"/>
       </w:pPr>
       <w:r>
-        <w:t xml:space="preserve">UNITED STATES BANKRUPTCY COURT</w:t>
+        <w:t xml:space="preserve">IN THE UNITED STATES BANKRUPTCY COURT</w:t>
       </w:r>
     </w:p>
     <w:p>
@@ -15,7 +15,7 @@
         <w:pStyle w:val="Centered"/>
       </w:pPr>
       <w:r>
-        <w:t xml:space="preserve">NORTHERN DISTRICT OF OHIO</w:t>
+        <w:t xml:space="preserve">FOR THE NORTHERN DISTRICT OF OHIO</w:t>
       </w:r>
     </w:p>
     <w:p>
@@ -23,7 +23,7 @@
         <w:pStyle w:val="Centered"/>
       </w:pPr>
       <w:r>
-        <w:t xml:space="preserve">EASTERN DIVISION</w:t>
+        <w:t xml:space="preserve">WESTERN DIVISION</w:t>
       </w:r>
     </w:p>
     <w:p>
@@ -67,7 +67,7 @@
               <w:pStyle w:val="Single"/>
             </w:pPr>
             <w:r>
-              <w:t xml:space="preserve">In re:</w:t>
+              <w:t xml:space="preserve">In Re: David L. Meddings and</w:t>
             </w:r>
           </w:p>
         </w:tc>
@@ -94,7 +94,7 @@
               <w:pStyle w:val="Single"/>
             </w:pPr>
             <w:r>
-              <w:t xml:space="preserve">Case No. 21-60255</w:t>
+              <w:t xml:space="preserve">Case No. 21-30046</w:t>
             </w:r>
           </w:p>
         </w:tc>
@@ -112,7 +112,7 @@
               <w:pStyle w:val="Single"/>
             </w:pPr>
             <w:r>
-              <w:t xml:space="preserve">TEMPLAR COMPANIES, LLC</w:t>
+              <w:t xml:space="preserve">Michelle L. Meddings</w:t>
             </w:r>
           </w:p>
         </w:tc>
@@ -181,7 +181,7 @@
               <w:pStyle w:val="Single"/>
             </w:pPr>
             <w:r>
-              <w:t xml:space="preserve">Judge Russ Kendig</w:t>
+              <w:t xml:space="preserve">Chapter 7</w:t>
             </w:r>
           </w:p>
         </w:tc>
@@ -265,7 +265,7 @@
               <w:pStyle w:val="Single"/>
             </w:pPr>
             <w:r>
-              <w:t xml:space="preserve">Adv. Pro. No. 21-6017</w:t>
+              <w:t xml:space="preserve">Judge JOHN P. GUSTAFSON</w:t>
             </w:r>
           </w:p>
         </w:tc>
@@ -322,7 +322,7 @@
               <w:pStyle w:val="Single"/>
             </w:pPr>
             <w:r>
-              <w:t xml:space="preserve">SCOTT C. SWEARINGEN</w:t>
+              <w:t xml:space="preserve">JAMES HARRISON,</w:t>
             </w:r>
           </w:p>
         </w:tc>
@@ -348,6 +348,9 @@
             <w:pPr>
               <w:pStyle w:val="Single"/>
             </w:pPr>
+            <w:r>
+              <w:t xml:space="preserve">Adv. Pro. No. 21-3021</w:t>
+            </w:r>
           </w:p>
         </w:tc>
       </w:tr>
@@ -364,7 +367,7 @@
               <w:pStyle w:val="Single"/>
             </w:pPr>
             <w:r>
-              <w:t xml:space="preserve">Plaintiff</w:t>
+              <w:t xml:space="preserve">Plaintiff,</w:t>
             </w:r>
           </w:p>
         </w:tc>
@@ -526,7 +529,7 @@
               <w:pStyle w:val="Single"/>
             </w:pPr>
             <w:r>
-              <w:t xml:space="preserve">TEMPLAR COMPANIES, LLC</w:t>
+              <w:t xml:space="preserve">DAVID L. MEDDINGS AND</w:t>
             </w:r>
           </w:p>
         </w:tc>
@@ -568,8 +571,47 @@
               <w:pStyle w:val="Single"/>
             </w:pPr>
             <w:r>
-              <w:t xml:space="preserve">Defendant.</w:t>
-            </w:r>
+              <w:t xml:space="preserve">MICHELLE L. MEDDINGS.</w:t>
+            </w:r>
+          </w:p>
+        </w:tc>
+        <w:tc>
+          <w:tcPr>
+            <w:tcW w:w="432" w:type="dxa"/>
+          </w:tcPr>
+          <w:p>
+            <w:pPr>
+              <w:pStyle w:val="Single"/>
+              <w:jc w:val="center"/>
+            </w:pPr>
+            <w:r>
+              <w:t xml:space="preserve">)</w:t>
+            </w:r>
+          </w:p>
+        </w:tc>
+        <w:tc>
+          <w:tcPr>
+            <w:tcW w:w="3882" w:type="dxa"/>
+          </w:tcPr>
+          <w:p>
+            <w:pPr>
+              <w:pStyle w:val="Single"/>
+            </w:pPr>
+          </w:p>
+        </w:tc>
+      </w:tr>
+      <w:tr>
+        <w:trPr>
+          <w:cantSplit/>
+        </w:trPr>
+        <w:tc>
+          <w:tcPr>
+            <w:tcW w:w="5046" w:type="dxa"/>
+          </w:tcPr>
+          <w:p>
+            <w:pPr>
+              <w:pStyle w:val="Single"/>
+            </w:pPr>
           </w:p>
         </w:tc>
         <w:tc>
@@ -613,7 +655,7 @@
           <w:b/>
           <w:bCs/>
         </w:rPr>
-        <w:t xml:space="preserve">MOTION TO DISMISS AMENDED COMPLAINT ASSERTING NON-DISCHARGEABILITY OF CERTAIN DEBTS PURSUANT TO SECTIONS 727(a)(2)(A) AND 727(a)(2)(B) OF THE BANKRUPTCY CODE</w:t>
+        <w:t xml:space="preserve">MOTION TO DISMISS</w:t>
       </w:r>
     </w:p>
     <w:p>
@@ -627,16 +669,7 @@
         <w:pStyle w:val="FirstParagraph"/>
       </w:pPr>
       <w:r>
-        <w:t xml:space="preserve">Now comes Defendant, Templar Companies, LLC (the</w:t>
-      </w:r>
-      <w:r>
-        <w:t xml:space="preserve"> </w:t>
-      </w:r>
-      <w:r>
-        <w:t xml:space="preserve">“Defendant”</w:t>
-      </w:r>
-      <w:r>
-        <w:t xml:space="preserve">), by and through counsel, and moves pursuant to Fed.R.Civ.P. 12(b)(6), made applicable by the Bankruptcy Rule 7012(b), to dismiss the Amended Complaint filed by Plaintiff Scott C. Swearingen, with prejudice, for failure to state a claim upon which relief may be granted.</w:t>
+        <w:t xml:space="preserve">Now comes the Debtors/Defendants, David L. Meddings and Michelle L. Meddings, by and through their attorney, M. Elizabeth Martindell, and hereby moves this Honorable Court to dismiss the adversary proceeding case in accordance with U.S.C. 12(b)(6) due to a failure to state a claim upon which relief can be granted due to issue preclusion. Further, the Plaintiff does not have standing to pursue this action as applied. Finally, allowing this Adversary Proceeding to proceed is against equity. The reasons for this motion are set forth in more detail in the accompanying memorandum.</w:t>
       </w:r>
     </w:p>
     <w:p>
@@ -644,15 +677,7 @@
         <w:pStyle w:val="BodyText"/>
       </w:pPr>
       <w:r>
-        <w:t xml:space="preserve">In support of its Motion to Dismiss, the Defendant files herewith a Memorandum of Law in Support of Motion to Dismiss.</w:t>
-      </w:r>
-    </w:p>
-    <w:p>
-      <w:pPr>
-        <w:pStyle w:val="BodyText"/>
-      </w:pPr>
-      <w:r>
-        <w:t xml:space="preserve">WHEREFORE, the Defendant prays that the Court dismiss this adversary proceeding, award the Defendant its costs, and grant such other and further relief as the Court deems just and appropriate.</w:t>
+        <w:t xml:space="preserve">WHEREFORE Defendants respectfully request that the Court sustain this Motion to Dismiss Case, and any other such relief as may be just and equitable under the law.</w:t>
       </w:r>
     </w:p>
     <w:p>
@@ -682,7 +707,7 @@
         <w:keepNext/>
       </w:pPr>
       <w:r>
-        <w:t xml:space="preserve">s/ Steven J. Heimberger</w:t>
+        <w:t xml:space="preserve">s/ M. Elizabeth Martindell</w:t>
       </w:r>
     </w:p>
     <w:p>
@@ -691,7 +716,7 @@
         <w:keepNext/>
       </w:pPr>
       <w:r>
-        <w:t xml:space="preserve">STEVEN J. HEIMBERGER (0084618)</w:t>
+        <w:t xml:space="preserve">M. Elizabeth Martindell, #0083920</w:t>
       </w:r>
     </w:p>
     <w:p>
@@ -699,7 +724,7 @@
         <w:pStyle w:val="Signature"/>
       </w:pPr>
       <w:r>
-        <w:t xml:space="preserve">Roderick Linton Belfance, LLP</w:t>
+        <w:t xml:space="preserve">Attorney for Debtors</w:t>
       </w:r>
     </w:p>
     <w:p>
@@ -707,7 +732,7 @@
         <w:pStyle w:val="Signature"/>
       </w:pPr>
       <w:r>
-        <w:t xml:space="preserve">50 S. Main Street, 10th Floor, Akron, Ohio 44308</w:t>
+        <w:t xml:space="preserve">1241 E. Center Street, Ste. C</w:t>
       </w:r>
     </w:p>
     <w:p>
@@ -715,7 +740,7 @@
         <w:pStyle w:val="Signature"/>
       </w:pPr>
       <w:r>
-        <w:t xml:space="preserve">434-3000, telephone; (330) 434-9220, fax</w:t>
+        <w:t xml:space="preserve">Marion, OH 43302</w:t>
       </w:r>
     </w:p>
     <w:p>
@@ -723,7 +748,7 @@
         <w:pStyle w:val="Signature"/>
       </w:pPr>
       <w:r>
-        <w:t xml:space="preserve">sheimberger@rlbllp.com</w:t>
+        <w:t xml:space="preserve">Phone: 740-382-6588</w:t>
       </w:r>
     </w:p>
     <w:p>
@@ -731,24 +756,33 @@
         <w:pStyle w:val="Signature"/>
       </w:pPr>
       <w:r>
-        <w:t xml:space="preserve">Attorney for Defendant, Templar Companies, LLC</w:t>
-      </w:r>
-    </w:p>
-    <w:bookmarkStart w:id="20" w:name="Xa8fca942bc03e5f4a409abe291081e36d79cf59"/>
+        <w:t xml:space="preserve">Fax: 740-375-5372</w:t>
+      </w:r>
+    </w:p>
+    <w:p>
+      <w:pPr>
+        <w:pStyle w:val="Signature"/>
+      </w:pPr>
+      <w:r>
+        <w:t xml:space="preserve">ElizabethMartindell@gmail.com</w:t>
+      </w:r>
+    </w:p>
     <w:p>
       <w:pPr>
         <w:pStyle w:val="Heading1"/>
       </w:pPr>
-      <w:r>
-        <w:t xml:space="preserve">MEMORANDUM IN SUPPORT OF MOTION TO DISMISS AMENDED COMPLAINT ASSERTING NON-DISCHARGEABILITY OF CERTAIN DEBTS PURSUANT TO SECTIONS 727(a)(2)(A) AND 727(a)(2)(B) OF THE BANKRUPTCY CODE</w:t>
-      </w:r>
+      <w:bookmarkStart w:id="109" w:name="_18fef08f8f6a4cc1109f735f487afc1f4c286fa"/>
+      <w:r>
+        <w:t xml:space="preserve">MEMORANDUM IN SUPPORT</w:t>
+      </w:r>
+      <w:bookmarkEnd w:id="109"/>
     </w:p>
     <w:p>
       <w:pPr>
         <w:pStyle w:val="FirstParagraph"/>
       </w:pPr>
       <w:r>
-        <w:t xml:space="preserve">1. On June 11, 2021 the Plaintiff Scott Swearingen filed his Adversary Proceeding Complaint. [ECF Doc. No. 1.]</w:t>
+        <w:t xml:space="preserve">Debtors/Defendants move that this Adversary Proceeding should be dismissed in accordance with U.S.C. 12(b)(6) due to a failure to state a claim upon which relief can be granted due to lack of subject matter jurisdiction, as well as collateral estoppel/issue and claim preclusion. Further, the Plaintiff lacks standing to bring the action as applied.</w:t>
       </w:r>
     </w:p>
     <w:p>
@@ -756,31 +790,7 @@
         <w:pStyle w:val="BodyText"/>
       </w:pPr>
       <w:r>
-        <w:t xml:space="preserve">2. On June 16, 2021 the Debtor, Templar Companies, LLC filed its Motion to Dismiss. [ECF Doc. No. 5.]</w:t>
-      </w:r>
-    </w:p>
-    <w:p>
-      <w:pPr>
-        <w:pStyle w:val="BodyText"/>
-      </w:pPr>
-      <w:r>
-        <w:t xml:space="preserve">3. On June 21, 2021 Plaintiff filed both his response to the Motion to Dismiss [ECF Doc. No. 11] and an Amended Complaint [ECF Doc. No. 10].</w:t>
-      </w:r>
-    </w:p>
-    <w:p>
-      <w:pPr>
-        <w:pStyle w:val="BodyText"/>
-      </w:pPr>
-      <w:r>
-        <w:t xml:space="preserve">4. Pursuant to Fed.R.Civ.P. 15(a)(1)(B), made applicable by Federal Rules of Bankruptcy Procedure Rule 7015, Plaintiff did not require leave of the Court to amend his Complaint because it was filed within 21 days after service of the Debtor’s Rule 12(b) motion.</w:t>
-      </w:r>
-    </w:p>
-    <w:p>
-      <w:pPr>
-        <w:pStyle w:val="BodyText"/>
-      </w:pPr>
-      <w:r>
-        <w:t xml:space="preserve">5. Because amended complaints supersede the original pleading, the filing of an amended complaint usually renders the pending motion to dismiss moot.</w:t>
+        <w:t xml:space="preserve">This Honorable Court lacks subject matter jurisdiction if the Plaintiff is advancing the same arguments as brought forth in the underlying civil case held in the Marion County Court of Common Pleas, Case Number 2017 CV 0613. Inasmuch as the Plaintiff is applying the same claims and arguments as were advanced in the initial Marion County Court case, the</w:t>
       </w:r>
       <w:r>
         <w:t xml:space="preserve"> </w:t>
@@ -790,22 +800,13 @@
           <w:i/>
           <w:iCs/>
         </w:rPr>
-        <w:t xml:space="preserve">Yates v. Applied Performance Techs., Inc.</w:t>
-      </w:r>
-      <w:r>
-        <w:t xml:space="preserve">, 205 F.R.D. 497, 499 (S.D. Ohio 2002).</w:t>
+        <w:t xml:space="preserve">Rooker-Feldman</w:t>
       </w:r>
       <w:r>
         <w:t xml:space="preserve"> </w:t>
       </w:r>
       <w:r>
-        <w:t xml:space="preserve">“The general rule is that an amended pleading supersedes the original and remains in effect, unless again modified, from that point forward.”</w:t>
-      </w:r>
-      <w:r>
-        <w:t xml:space="preserve"> </w:t>
-      </w:r>
-      <w:r>
-        <w:t xml:space="preserve">6 Wright, Federal Practice &amp; Procedure § 1476, at 556-57 (2nd ed. 1990 &amp; Supp. 2001). Once an amended pleading is filed, the original pleading no longer performs any function in the case.</w:t>
+        <w:t xml:space="preserve">doctrine should be applied to dismiss the Adversary Proceeding. The</w:t>
       </w:r>
       <w:r>
         <w:t xml:space="preserve"> </w:t>
@@ -815,13 +816,13 @@
           <w:i/>
           <w:iCs/>
         </w:rPr>
-        <w:t xml:space="preserve">Id.</w:t>
+        <w:t xml:space="preserve">Rooker-Feldman</w:t>
       </w:r>
       <w:r>
         <w:t xml:space="preserve"> </w:t>
       </w:r>
       <w:r>
-        <w:t xml:space="preserve">Any subsequent motion filed by the opposing party should be directed at the amended pleading.</w:t>
+        <w:t xml:space="preserve">doctrine is derived from two Supreme Court cases: Rooker v. Fidelity Trust Co., 263 U.S. 413, 44 S.Ct. 149, 68 L.Ed.2d 362 (1923) and District of Columbia Court of Appeals v. Feldman, 460 U.S. 462, 103 S.Ct. 1303, 75 L.Ed.2d 206 (1983). The Sixth Circuit Court of Appeals has explained: [T]he federal claim is inextricably intertwined with the state court judgment if the federal claim succeeds only to the extent that the state court wrongly decided the issues before it. Where federal relief can only be predicated upon a conviction that the state court was wrong, it is difficult to conceive the federal proceeding as, in substance, anything other than a prohibited appeal of the state court judgment. Id., quoting Catz v. Chalker, 142 F.3d 279, 293 (6th Cir., 1998). Thus, the</w:t>
       </w:r>
       <w:r>
         <w:t xml:space="preserve"> </w:t>
@@ -831,45 +832,93 @@
           <w:i/>
           <w:iCs/>
         </w:rPr>
-        <w:t xml:space="preserve">Id.</w:t>
+        <w:t xml:space="preserve">Rooker-Feldman</w:t>
       </w:r>
       <w:r>
         <w:t xml:space="preserve"> </w:t>
       </w:r>
       <w:r>
-        <w:t xml:space="preserve">(citing</w:t>
+        <w:t xml:space="preserve">doctrine compels the entry of an order dismissing Plaintiff’s Adversarial Complaint. Durham v. Haslam, et. al., 528 Fed.Appx. 559, 563 (6th Cir., 2013); Kovacic v. Cuyahoga County Dept. of Children &amp; Family Services, 606 F.3d 301, 309-310 (6th Cir., 2010).</w:t>
+      </w:r>
+    </w:p>
+    <w:p>
+      <w:pPr>
+        <w:pStyle w:val="BodyText"/>
+      </w:pPr>
+      <w:r>
+        <w:t xml:space="preserve">Further, collateral estoppel applies to this case. According to 28 U.S.C. § 1738, the federal Full Faith and Credit statute, a federal court must accord a state court judgment the same preclusive effect the judgment would have in state court. Corzin v. Fordu (In re Fordu), 201 F.3d 693, 703 (6th Cir. 1999). Thus, the doctrines of issue and claim preclusion are analyzed accordingly.</w:t>
+      </w:r>
+    </w:p>
+    <w:p>
+      <w:pPr>
+        <w:pStyle w:val="BodyText"/>
+      </w:pPr>
+      <w:r>
+        <w:t xml:space="preserve">In Ohio, there are four requirements for the application of the doctrine of issue preclusion: (1) a final judgment on the merits after a full and fair opportunity to litigate the issue; (2) the issue was actually and directly litigated in the prior action and must have been necessary to the final judgment; (3) the issue in the present suit must have been identical to the issue in the prior suit; and (4) the party against whom estoppel is sought was a party or in privity with the party in the prior action. Sill v. Sweeney (In re Sweeney), 276 B.R. 186, 189 (B.A.P. 6th Cir. 2002) (citing Gonzalez v. Moffitt (In re Moffitt), 252 B.R. 916, 921 (B.A.P. 6th Cir. 2000)); Thompson v. Wing, 70 Ohio St.3d 176, 183 (1994). The party asserting issue preclusion carries the burden of proving its requirements by a preponderance of the evidence. Simmons Capital Advisors, Ltd. v. Bachinski (In re Bachinski), 393 B.R. 522, 535 (Bankr. S.D. Ohio 2008).</w:t>
+      </w:r>
+    </w:p>
+    <w:p>
+      <w:pPr>
+        <w:pStyle w:val="BodyText"/>
+      </w:pPr>
+      <w:r>
+        <w:t xml:space="preserve">In the present case, the prior litigation in the Marion County Court of Common Pleas, Case Number 2017 CV 0613, did deliver a final, valid decision on the merits regarding the business debt of the Meddings. Although personal liability was still in litigation, there has been much previous discovery with many findings of fact already determined. These issues should not be relitigated in bankruptcy court where the Defendants/Debtors have already exhausted their resources. Further, the parties are still James Harrison versus David and Michelle Meddings, the same parties as in the Marion County Court of Common Pleas lawsuit.</w:t>
+      </w:r>
+    </w:p>
+    <w:p>
+      <w:pPr>
+        <w:pStyle w:val="BodyText"/>
+      </w:pPr>
+      <w:r>
+        <w:t xml:space="preserve">Under Ohio law, claim preclusion bars further litigation when there is: (1) a prior final, valid decision on the merits by a court of competent jurisdiction; (2) a second action involving the same parties as the first; (3) a second action raising claims that were or could have been litigated in the first action; and (4) a second action that arises out of the transaction or occurrence that was the subject of the previous action. Hapgood v. City of Warren, 127 F.3d 490, 493 (6th Cir., 1997); Grava v. Parkman Township, 73 Ohio St.3d 379, 653 N.E.2d 226, 229 (1995).</w:t>
+      </w:r>
+    </w:p>
+    <w:p>
+      <w:pPr>
+        <w:pStyle w:val="BodyText"/>
+      </w:pPr>
+      <w:r>
+        <w:t xml:space="preserve">Given that the prior litigation in the Marion County Court of Common Pleas, Case Number 2017 CV 0613, did deliver a final, valid decision on the merits regarding the business debt of the Meddings, this is a second action involving the same parties as the first, and this action is both a second action in which the Plaintiff brings up some of the claims that have been litigated in the first action, as well as a second action that arises out of the same occurrence of contractual default, thus the doctrine of claim preclusion applies.</w:t>
+      </w:r>
+    </w:p>
+    <w:p>
+      <w:pPr>
+        <w:pStyle w:val="BodyText"/>
+      </w:pPr>
+      <w:r>
+        <w:t xml:space="preserve">It appears that the only difference in how the Adversary Proceeding is approached by the Plaintiff is the pursuit of arguments related to the mortgage refinancing that Defendants/Debtors effected in 2020, several months prior to filing the bankruptcy action, and at a time when they did not contemplate filing a bankruptcy action. This mortgage refinancing is the standard process to deal with a balloon payment, and the Meddings addressed the balloon payment due on their previous mortgage through this standard process. The equity funds cashed in went towards mortgage refinancing fees, paying three different contractors to make improvements to the home, and for Mr. and Mrs. Meddings to buy further materials to make their own improvements to the home.</w:t>
+      </w:r>
+    </w:p>
+    <w:p>
+      <w:pPr>
+        <w:pStyle w:val="BodyText"/>
+      </w:pPr>
+      <w:r>
+        <w:t xml:space="preserve">The Plaintiff does not have standing to pursue this action as applied. Plaintiff alleges that 11 U.S.C. 523(a)(2)(A) excludes debts</w:t>
       </w:r>
       <w:r>
         <w:t xml:space="preserve"> </w:t>
       </w:r>
       <w:r>
-        <w:rPr>
-          <w:i/>
-          <w:iCs/>
-        </w:rPr>
-        <w:t xml:space="preserve">Hartman v. Register</w:t>
-      </w:r>
-      <w:r>
-        <w:t xml:space="preserve">, No. 1:06-cv-33, 2007 U.S. Dist. LEXIS 21175 (S.D. Ohio Mar. 26, 2007) (holding that defendants’ motions to dismiss the original complaint and the first amended complaint were moot given the subsequent filing of a second amended complaint)); see also</w:t>
+        <w:t xml:space="preserve">“to the extent the indebtedness was obtained by false pretenses, a false representation or actual fraud”</w:t>
       </w:r>
       <w:r>
         <w:t xml:space="preserve"> </w:t>
       </w:r>
       <w:r>
-        <w:rPr>
-          <w:i/>
-          <w:iCs/>
-        </w:rPr>
-        <w:t xml:space="preserve">Pethtel v. Washington County Sheriff’s Office</w:t>
-      </w:r>
-      <w:r>
-        <w:t xml:space="preserve">, No. 2:06-799, 2007 U.S. Dist. LEXIS 60105, at *12-13 (S.D. Ohio Aug. 16, 2007) (</w:t>
-      </w:r>
-      <w:r>
-        <w:t xml:space="preserve">“because an amended complaint supersedes the original complaint, the filing of an amended complaint normally moots a motion to dismiss the original complaint”</w:t>
-      </w:r>
-      <w:r>
-        <w:t xml:space="preserve">).</w:t>
+        <w:t xml:space="preserve">from discharge and that 11 U.S.C. 523(a)(6) excludes debts</w:t>
+      </w:r>
+      <w:r>
+        <w:t xml:space="preserve"> </w:t>
+      </w:r>
+      <w:r>
+        <w:t xml:space="preserve">“for willful and malicious injury by the debtor to another entity or to the property of another entity”</w:t>
+      </w:r>
+      <w:r>
+        <w:t xml:space="preserve"> </w:t>
+      </w:r>
+      <w:r>
+        <w:t xml:space="preserve">from discharge. However, in advancing both of these arguments, the Plaintiff has only presented harm to himself. He has never asserted that the mortgage company was injured by the refinancing, and, in fact, the mortgage company likely entered into the refinancing contract as a benefit to them. Plaintiff lacks standing for filing this adversary action when the crux of his argument appears to be that the mortgage refinance was fraudulent or causing a willful and malicious injury.</w:t>
       </w:r>
     </w:p>
     <w:p>
@@ -877,33 +926,19 @@
         <w:pStyle w:val="BodyText"/>
       </w:pPr>
       <w:r>
-        <w:t xml:space="preserve">6. The only circumstances in which filing an amended complaint may not moot a motion to dismiss is when the amended complaint is substantially identical to the original complaint.</w:t>
+        <w:t xml:space="preserve">Finally, Plaintiff’s filing of the Adversary Proceeding is against decent principals of equity. Under §105(a) of the Bankruptcy Code, which states that</w:t>
       </w:r>
       <w:r>
         <w:t xml:space="preserve"> </w:t>
       </w:r>
       <w:r>
-        <w:rPr>
-          <w:i/>
-          <w:iCs/>
-        </w:rPr>
-        <w:t xml:space="preserve">Pethtel</w:t>
-      </w:r>
-      <w:r>
-        <w:t xml:space="preserve">, 2007 U.S. Dist. LEXIS 60105, at *12-13. For example, when a motion to amend only addresses a discrete issue, it may not moot the underlying motion to dismiss.</w:t>
+        <w:t xml:space="preserve">“The court may issue any order, process, or judgment that is necessary or appropriate to carry out the provisions of this title.”</w:t>
       </w:r>
       <w:r>
         <w:t xml:space="preserve"> </w:t>
       </w:r>
       <w:r>
-        <w:rPr>
-          <w:i/>
-          <w:iCs/>
-        </w:rPr>
-        <w:t xml:space="preserve">In re: GI Holdings</w:t>
-      </w:r>
-      <w:r>
-        <w:t xml:space="preserve">, 122 Fed. Appx. 554, 556 (3rd Cir. 2004).</w:t>
+        <w:t xml:space="preserve">Bankruptcy courts sit in equity. See Norwest Bank Worthington v. Ahlers, 485 U.S. 197, 206, 108 S.Ct. 963, 99 L.Ed.2d 169 (1988). So long as it is exercising that power within the bounds of the Bankruptcy Code (and the Constitution, Stern v. Marshall, 564 U.S. 462, 131 S.Ct. 2594, 2620, 180 L.Ed.2d 475 (2011)), a bankruptcy court may answer the nondischargeability question without deciding the value of the claim. See 11 U.S.C. § 105(a); In re Granger Garage, Inc., 921 F.2d 74, 77 (6th Cir.1990).</w:t>
       </w:r>
     </w:p>
     <w:p>
@@ -911,7 +946,31 @@
         <w:pStyle w:val="BodyText"/>
       </w:pPr>
       <w:r>
-        <w:t xml:space="preserve">7. The Plaintiff’s Amended Complaint appears to be substantively identical to his original Complaint, and 11 U.S.C. § 727(a) remains clear that a discharge relates only to an individual debtor.</w:t>
+        <w:t xml:space="preserve">The Plaintiff appears to have filed the Adversary Proceeding in the spirit of further punishing Mr. And Mrs. Meddings. Plaintiff has already forced the Meddings to spend years and a small fortune in litigation. This action was enough to prevent the Defendants from reopening their business and the continued litigation has resulted in Mr. and Mrs. Meddings being forced into bankruptcy, all while the Plaintiff still expends his significant resources to further pressure Mr. and Mrs. Meddings into hardship. Such a result is against equity and interferes with the ability of Defendants to have a fresh start after the bankruptcy case is resolved. The statutory exceptions are intended to implement the fundamental bankruptcy policy of affording a</w:t>
+      </w:r>
+      <w:r>
+        <w:t xml:space="preserve"> </w:t>
+      </w:r>
+      <w:r>
+        <w:t xml:space="preserve">“fresh start”</w:t>
+      </w:r>
+      <w:r>
+        <w:t xml:space="preserve"> </w:t>
+      </w:r>
+      <w:r>
+        <w:t xml:space="preserve">only to</w:t>
+      </w:r>
+      <w:r>
+        <w:t xml:space="preserve"> </w:t>
+      </w:r>
+      <w:r>
+        <w:t xml:space="preserve">“the honest but unfortunate debtor.”</w:t>
+      </w:r>
+      <w:r>
+        <w:t xml:space="preserve"> </w:t>
+      </w:r>
+      <w:r>
+        <w:t xml:space="preserve">Id. (citing Grogan v. Garner, 498 U.S. 279, 286-87 (1991)). In order to implement the fresh start policy, the exceptions to discharge for debts listed in § 523(a) are to be construed narrowly. Rembert v. AT&amp;T Universal Card Svcs., Inc. (In re Rembert), 141 F.3d 277, 281 (6th Cir. 1998).</w:t>
       </w:r>
     </w:p>
     <w:p>
@@ -919,31 +978,7 @@
         <w:pStyle w:val="BodyText"/>
       </w:pPr>
       <w:r>
-        <w:t xml:space="preserve">8. Because the Debtor is not an individual, no discharge is available to Debtor as a matter of law and the Complaint fails in its reliance on 11 U.S.C. § 727(a)(2). No such cause of action against the Debtor exists.</w:t>
-      </w:r>
-    </w:p>
-    <w:p>
-      <w:pPr>
-        <w:pStyle w:val="BodyText"/>
-      </w:pPr>
-      <w:r>
-        <w:t xml:space="preserve">9. Instead of presenting a cognizable claim against the Debtor that is designed to be litigated through an adversary proceeding under Federal Rules of Bankruptcy Procedure Rule 7001, Plaintiff appears to be attempting to use the adversary proceeding process to harass the Debtor’s owner Robert Norman and interfere with his fresh start in connection with the bankruptcy discharge that he received in U.S. Bankruptcy Court Northern District of Ohio Case No. 19-61286-rk.</w:t>
-      </w:r>
-    </w:p>
-    <w:p>
-      <w:pPr>
-        <w:pStyle w:val="BodyText"/>
-      </w:pPr>
-      <w:r>
-        <w:t xml:space="preserve">10. The Debtor hereby incorporates and renews his Motion to Dismiss filed with this Court on June 16, 2021 (ECF Doc. No. 5) in its entirety in support of this Motion.</w:t>
-      </w:r>
-    </w:p>
-    <w:p>
-      <w:pPr>
-        <w:pStyle w:val="BodyText"/>
-      </w:pPr>
-      <w:r>
-        <w:t xml:space="preserve">For each and all of the above-cited reasons, Defendant Templar Companies, LLC respectfully requests that this Court dismiss the Plaintiff’s Amended Complaint, awarding costs to the Defendant and such other and further relief as the Court deems just and appropriate.</w:t>
+        <w:t xml:space="preserve">WHEREFORE Defendants respectfully request that the Court sustain this Motion to Dismiss Case, and any other such relief as may be just and equitable under the law.</w:t>
       </w:r>
     </w:p>
     <w:p>
@@ -973,7 +1008,7 @@
         <w:keepNext/>
       </w:pPr>
       <w:r>
-        <w:t xml:space="preserve">s/ Steven J. Heimberger</w:t>
+        <w:t xml:space="preserve">s/ M. Elizabeth Martindell</w:t>
       </w:r>
     </w:p>
     <w:p>
@@ -982,7 +1017,7 @@
         <w:keepNext/>
       </w:pPr>
       <w:r>
-        <w:t xml:space="preserve">STEVEN J. HEIMBERGER (0084618)</w:t>
+        <w:t xml:space="preserve">M. Elizabeth Martindell, #0083920</w:t>
       </w:r>
     </w:p>
     <w:p>
@@ -990,7 +1025,7 @@
         <w:pStyle w:val="Signature"/>
       </w:pPr>
       <w:r>
-        <w:t xml:space="preserve">Roderick Linton Belfance, LLP</w:t>
+        <w:t xml:space="preserve">Attorney for Debtors</w:t>
       </w:r>
     </w:p>
     <w:p>
@@ -998,7 +1033,7 @@
         <w:pStyle w:val="Signature"/>
       </w:pPr>
       <w:r>
-        <w:t xml:space="preserve">50 S. Main Street, 10th Floor, Akron, Ohio 44308</w:t>
+        <w:t xml:space="preserve">1241 E. Center Street, Ste. C</w:t>
       </w:r>
     </w:p>
     <w:p>
@@ -1006,7 +1041,7 @@
         <w:pStyle w:val="Signature"/>
       </w:pPr>
       <w:r>
-        <w:t xml:space="preserve">434-3000, telephone; (330) 434-9220, fax</w:t>
+        <w:t xml:space="preserve">Marion, OH 43302</w:t>
       </w:r>
     </w:p>
     <w:p>
@@ -1014,7 +1049,7 @@
         <w:pStyle w:val="Signature"/>
       </w:pPr>
       <w:r>
-        <w:t xml:space="preserve">sheimberger@rlbllp.com</w:t>
+        <w:t xml:space="preserve">Phone: 740-382-6588</w:t>
       </w:r>
     </w:p>
     <w:p>
@@ -1022,7 +1057,15 @@
         <w:pStyle w:val="Signature"/>
       </w:pPr>
       <w:r>
-        <w:t xml:space="preserve">Attorney for Defendant, Templar Companies, LLC</w:t>
+        <w:t xml:space="preserve">Fax: 740-375-5372</w:t>
+      </w:r>
+    </w:p>
+    <w:p>
+      <w:pPr>
+        <w:pStyle w:val="Signature"/>
+      </w:pPr>
+      <w:r>
+        <w:t xml:space="preserve">ElizabethMartindell@gmail.com</w:t>
       </w:r>
     </w:p>
     <w:p>
@@ -1077,15 +1120,135 @@
         <w:pStyle w:val="BodyText"/>
       </w:pPr>
       <w:r>
-        <w:t xml:space="preserve">I hereby certify that on June 24, 2021, a true copy of the foregoing Motion to Dismiss Amended Complaint and Memorandum in Support was served via the Court’s electronic case filing system on the entities listed on the Court’s electronic mail notice list, including the Office of the United States Trustee, and by regular U.S. Mail, postage prepaid, to:</w:t>
-      </w:r>
-    </w:p>
-    <w:p>
-      <w:pPr>
-        <w:pStyle w:val="Single"/>
-      </w:pPr>
-      <w:r>
-        <w:t xml:space="preserve">Scott C. Swearingen, 1938 11th Street SW, Akron, OH 44314</w:t>
+        <w:t xml:space="preserve">I hereby certify that on 16th of September, 2021, a true copy of the foregoing application was served electronically to:</w:t>
+      </w:r>
+    </w:p>
+    <w:p>
+      <w:pPr>
+        <w:pStyle w:val="Single"/>
+      </w:pPr>
+      <w:r>
+        <w:t xml:space="preserve">United States Trustee</w:t>
+      </w:r>
+    </w:p>
+    <w:p>
+      <w:pPr>
+        <w:pStyle w:val="Single"/>
+      </w:pPr>
+      <w:r>
+        <w:t xml:space="preserve">US Courthouse</w:t>
+      </w:r>
+    </w:p>
+    <w:p>
+      <w:pPr>
+        <w:pStyle w:val="Single"/>
+      </w:pPr>
+      <w:r>
+        <w:t xml:space="preserve">201 Superior Av. E Ste. 401</w:t>
+      </w:r>
+    </w:p>
+    <w:p>
+      <w:pPr>
+        <w:pStyle w:val="Single"/>
+      </w:pPr>
+      <w:r>
+        <w:t xml:space="preserve">Cleveland, OH 41114</w:t>
+      </w:r>
+    </w:p>
+    <w:p>
+      <w:pPr>
+        <w:pStyle w:val="Single"/>
+      </w:pPr>
+      <w:r>
+        <w:t xml:space="preserve">(Served via ECF)</w:t>
+      </w:r>
+    </w:p>
+    <w:p>
+      <w:pPr>
+        <w:pStyle w:val="Single"/>
+      </w:pPr>
+      <w:r>
+        <w:t xml:space="preserve">William Swope</w:t>
+      </w:r>
+    </w:p>
+    <w:p>
+      <w:pPr>
+        <w:pStyle w:val="Single"/>
+      </w:pPr>
+      <w:r>
+        <w:t xml:space="preserve">Chapter 7 Trustee</w:t>
+      </w:r>
+    </w:p>
+    <w:p>
+      <w:pPr>
+        <w:pStyle w:val="Single"/>
+      </w:pPr>
+      <w:r>
+        <w:t xml:space="preserve">610 Tiffin Avenue</w:t>
+      </w:r>
+    </w:p>
+    <w:p>
+      <w:pPr>
+        <w:pStyle w:val="Single"/>
+      </w:pPr>
+      <w:r>
+        <w:t xml:space="preserve">Findlay, OH 45840-3336</w:t>
+      </w:r>
+    </w:p>
+    <w:p>
+      <w:pPr>
+        <w:pStyle w:val="Single"/>
+      </w:pPr>
+      <w:r>
+        <w:t xml:space="preserve">(Served via ECF)</w:t>
+      </w:r>
+    </w:p>
+    <w:p>
+      <w:pPr>
+        <w:pStyle w:val="Single"/>
+      </w:pPr>
+      <w:r>
+        <w:t xml:space="preserve">Charles M. Elsea</w:t>
+      </w:r>
+    </w:p>
+    <w:p>
+      <w:pPr>
+        <w:pStyle w:val="Single"/>
+      </w:pPr>
+      <w:r>
+        <w:t xml:space="preserve">Stebelton Snider LPA</w:t>
+      </w:r>
+    </w:p>
+    <w:p>
+      <w:pPr>
+        <w:pStyle w:val="Single"/>
+      </w:pPr>
+      <w:r>
+        <w:t xml:space="preserve">109 N. Broad Street, Ste. 200</w:t>
+      </w:r>
+    </w:p>
+    <w:p>
+      <w:pPr>
+        <w:pStyle w:val="Single"/>
+      </w:pPr>
+      <w:r>
+        <w:t xml:space="preserve">PO Box 130</w:t>
+      </w:r>
+    </w:p>
+    <w:p>
+      <w:pPr>
+        <w:pStyle w:val="Single"/>
+      </w:pPr>
+      <w:r>
+        <w:t xml:space="preserve">Lancaster, Ohio 431030</w:t>
+      </w:r>
+    </w:p>
+    <w:p>
+      <w:pPr>
+        <w:pStyle w:val="Single"/>
+      </w:pPr>
+      <w:r>
+        <w:t xml:space="preserve">(served via ECF and US mail)</w:t>
       </w:r>
     </w:p>
     <w:p>
@@ -1100,7 +1263,7 @@
         <w:keepNext/>
       </w:pPr>
       <w:r>
-        <w:t xml:space="preserve">s/ Steven J. Heimberger</w:t>
+        <w:t xml:space="preserve">s/ M. Elizabeth Martindell</w:t>
       </w:r>
     </w:p>
     <w:p>
@@ -1108,10 +1271,9 @@
         <w:pStyle w:val="Signature"/>
       </w:pPr>
       <w:r>
-        <w:t xml:space="preserve">STEVEN J. HEIMBERGER (0084618)</w:t>
-      </w:r>
-    </w:p>
-    <w:bookmarkEnd w:id="20"/>
+        <w:t xml:space="preserve">M. Elizabeth Martindell, #0083920</w:t>
+      </w:r>
+    </w:p>
     <w:sectPr>
       <w:footerReference w:type="default" r:id="rId100"/>
       <w:pgSz w:w="12240" w:h="15840"/>

</xml_diff>